<commit_message>
feat: SEG-01 + SEG-02 QA verified - v0.22.0
</commit_message>
<xml_diff>
--- a/Do-Do-Founders-Brief-v2.docx
+++ b/Do-Do-Founders-Brief-v2.docx
@@ -789,7 +789,7 @@
           <w:color w:val="1C1C2E"/>
           <w:sz w:val="26"/>
         </w:rPr>
-        <w:t>Six core modules - unified, not fragmented</w:t>
+        <w:t>Eight modules - unified, not fragmented</w:t>
       </w:r>
     </w:p>
     <w:p>
@@ -845,14 +845,14 @@
           <w:color w:val="1C1C2E"/>
           <w:sz w:val="22"/>
         </w:rPr>
-        <w:t xml:space="preserve">bi-directional Google Calendar and Apple iCloud. Conflicts detected with AI suggestions.: </w:t>
+        <w:t xml:space="preserve">time-grid view with hour-snap drag, recurring events, bi-directional Google and Apple sync, import any Google Calendar, conflicts flagged with AI.: </w:t>
       </w:r>
       <w:r>
         <w:rPr>
           <w:color w:val="3D405B"/>
           <w:sz w:val="22"/>
         </w:rPr>
-        <w:t>Calendar Sync</w:t>
+        <w:t>Calendar</w:t>
       </w:r>
     </w:p>
     <w:p>
@@ -887,7 +887,7 @@
           <w:color w:val="1C1C2E"/>
           <w:sz w:val="22"/>
         </w:rPr>
-        <w:t xml:space="preserve">server-side cron, both devices, quiet hours respected.: </w:t>
+        <w:t xml:space="preserve">server-side cron, smart routing to the right person, quiet hours respected, app-only or calendar-linked delivery.: </w:t>
       </w:r>
       <w:r>
         <w:rPr>
@@ -908,7 +908,7 @@
           <w:color w:val="1C1C2E"/>
           <w:sz w:val="22"/>
         </w:rPr>
-        <w:t xml:space="preserve">topic threads per card. Context stays with the item. Real-time sync.: </w:t>
+        <w:t xml:space="preserve">feed of cards with real messages, sorted by latest activity. System notifications excluded. Real-time sync.: </w:t>
       </w:r>
       <w:r>
         <w:rPr>
@@ -916,6 +916,48 @@
           <w:sz w:val="22"/>
         </w:rPr>
         <w:t>Messages</w:t>
+      </w:r>
+    </w:p>
+    <w:p>
+      <w:pPr>
+        <w:pStyle w:val="ListBullet"/>
+        <w:spacing w:before="20" w:after="20"/>
+      </w:pPr>
+      <w:r>
+        <w:rPr>
+          <w:b/>
+          <w:color w:val="1C1C2E"/>
+          <w:sz w:val="22"/>
+        </w:rPr>
+        <w:t xml:space="preserve">shared list with real-time sync, paste multiple items at once, clear bought items in one tap.: </w:t>
+      </w:r>
+      <w:r>
+        <w:rPr>
+          <w:color w:val="3D405B"/>
+          <w:sz w:val="22"/>
+        </w:rPr>
+        <w:t>Shopping List</w:t>
+      </w:r>
+    </w:p>
+    <w:p>
+      <w:pPr>
+        <w:pStyle w:val="ListBullet"/>
+        <w:spacing w:before="20" w:after="20"/>
+      </w:pPr>
+      <w:r>
+        <w:rPr>
+          <w:b/>
+          <w:color w:val="1C1C2E"/>
+          <w:sz w:val="22"/>
+        </w:rPr>
+        <w:t xml:space="preserve">7-7, 2-2-3, 5-2 custody templates, vacation overlays, day overrides, change requests with approve/decline.: </w:t>
+      </w:r>
+      <w:r>
+        <w:rPr>
+          <w:color w:val="3D405B"/>
+          <w:sz w:val="22"/>
+        </w:rPr>
+        <w:t>Custody Calendar</w:t>
       </w:r>
     </w:p>
     <w:p>

</xml_diff>